<commit_message>
docs: atualizar documentacao de status exibido e financeiro automatico
</commit_message>
<xml_diff>
--- a/AccessManager.docx
+++ b/AccessManager.docx
@@ -35,242 +35,171 @@
 </file>
 
 <file path=word\document.xml><?xml version="1.0" encoding="utf-8"?>
-<w:document xmlns:wpc="http://schemas.microsoft.com/office/word/2010/wordprocessingCanvas" xmlns:mc="http://schemas.openxmlformats.org/markup-compatibility/2006" xmlns:o="urn:schemas-microsoft-com:office:office" xmlns:r="http://schemas.openxmlformats.org/officeDocument/2006/relationships" xmlns:m="http://schemas.openxmlformats.org/officeDocument/2006/math" xmlns:v="urn:schemas-microsoft-com:vml" xmlns:wp14="http://schemas.microsoft.com/office/word/2010/wordprocessingDrawing" xmlns:wp="http://schemas.openxmlformats.org/drawingml/2006/wordprocessingDrawing" xmlns:w10="urn:schemas-microsoft-com:office:word" xmlns:w="http://schemas.openxmlformats.org/wordprocessingml/2006/main" xmlns:w14="http://schemas.microsoft.com/office/word/2010/wordml" xmlns:wpg="http://schemas.microsoft.com/office/word/2010/wordprocessingGroup" xmlns:wpi="http://schemas.microsoft.com/office/word/2010/wordprocessingInk" xmlns:wne="http://schemas.microsoft.com/office/word/2006/wordml" xmlns:wps="http://schemas.microsoft.com/office/word/2010/wordprocessingShape" mc:Ignorable="w14 wp14">
+<w:document xmlns:w="http://schemas.openxmlformats.org/wordprocessingml/2006/main">
   <w:body>
     <w:p>
-      <w:pPr>
-        <w:pStyle w:val="Title"/>
-      </w:pPr>
       <w:r>
         <w:t xml:space="preserve">AccessManager</w:t>
       </w:r>
     </w:p>
     <w:p>
-      <w:pPr>
-        <w:pStyle w:val="Subtitle"/>
-      </w:pPr>
       <w:r>
         <w:t xml:space="preserve">Gestao completa de clientes, telas, servidores e financeiro operacional</w:t>
       </w:r>
     </w:p>
-    <w:p/>
     <w:p>
-      <w:pPr>
-        <w:pStyle w:val="Heading1"/>
-      </w:pPr>
       <w:r>
         <w:t xml:space="preserve">Introducao</w:t>
       </w:r>
     </w:p>
     <w:p>
       <w:r>
-        <w:t xml:space="preserve">O AccessManager e um sistema interno para organizar a operacao de clientes, telas de acesso, servidores e financeiro em um unico painel. Ele foi pensado para negocios que precisam controlar multiplos acessos por cliente, acompanhar vencimentos tecnicos e enxergar a situacao financeira sem depender de planilhas ou controles soltos.</w:t>
+        <w:t xml:space="preserve">O AccessManager e uma solucao interna para organizar a rotina de clientes, telas de acesso, servidores e financeiro em um unico painel. O sistema foi pensado para negocios que precisam acompanhar varios acessos por cliente, controlar vencimentos tecnicos e manter uma visao clara de pagamentos, pendencias e custos operacionais.</w:t>
       </w:r>
     </w:p>
     <w:p>
       <w:r>
-        <w:t xml:space="preserve">A solucao ja cobre o fluxo principal do negocio: cadastro de clientes, gestao de telas independentes, servidores com creditos e custo operacional, cobranca por cliente, dashboard gerencial e historico tecnico das principais mudancas.</w:t>
+        <w:t xml:space="preserve">A plataforma centraliza informacoes que normalmente ficam espalhadas em planilhas, mensagens e anotacoes. Com isso, o gestor ganha previsibilidade, reduz retrabalho e evita confundir renovacao tecnica com pagamento financeiro.</w:t>
       </w:r>
     </w:p>
-    <w:p/>
     <w:p>
-      <w:pPr>
-        <w:pStyle w:val="Heading1"/>
-      </w:pPr>
       <w:r>
         <w:t xml:space="preserve">Problema</w:t>
       </w:r>
     </w:p>
     <w:p>
       <w:r>
-        <w:t xml:space="preserve">Operacoes baseadas em planilhas ou anotacoes manuais costumam gerar perda de informacao, cobrancas inconsistentes, dificuldade para saber quem esta vencido e pouca clareza sobre custo por servidor.</w:t>
+        <w:t xml:space="preserve">Operacoes manuais costumam gerar perda de informacao, cobrancas inconsistentes e dificuldade para saber quais telas estao ativas, vencendo ou vencidas. Tambem e comum faltar clareza sobre clientes pendentes, servidores mais utilizados e custo real da operacao.</w:t>
       </w:r>
     </w:p>
     <w:p>
       <w:r>
-        <w:t xml:space="preserve">Os principais problemas que o AccessManager resolve sao:</w:t>
+        <w:t xml:space="preserve">Principais desafios resolvidos:</w:t>
       </w:r>
     </w:p>
     <w:p>
       <w:r>
-        <w:t xml:space="preserve">- Falta de visao centralizada dos clientes e telas cadastradas.</w:t>
+        <w:t xml:space="preserve">- Visao centralizada de clientes, telas e servidores.</w:t>
       </w:r>
     </w:p>
     <w:p>
       <w:r>
-        <w:t xml:space="preserve">- Dificuldade de acompanhar vencimentos tecnicos de cada tela.</w:t>
+        <w:t xml:space="preserve">- Controle individual de vencimento tecnico por tela.</w:t>
       </w:r>
     </w:p>
     <w:p>
       <w:r>
-        <w:t xml:space="preserve">- Financeiro misturado com renovacao tecnica, criando risco de liberar acesso por engano.</w:t>
+        <w:t xml:space="preserve">- Status inteligente para identificar telas ativas, vencendo, vencidas, suspensas ou canceladas.</w:t>
       </w:r>
     </w:p>
     <w:p>
       <w:r>
-        <w:t xml:space="preserve">- Pouca visibilidade sobre clientes pagos, pendentes e atrasados.</w:t>
+        <w:t xml:space="preserve">- Financeiro separado da renovacao tecnica, reduzindo risco de liberar acesso por engano.</w:t>
       </w:r>
     </w:p>
     <w:p>
       <w:r>
-        <w:t xml:space="preserve">- Falta de controle sobre uso e custo dos servidores.</w:t>
+        <w:t xml:space="preserve">- Pendencias financeiras geradas antes do vencimento, conforme o dia de pagamento do cliente.</w:t>
       </w:r>
     </w:p>
     <w:p>
       <w:r>
-        <w:t xml:space="preserve">- Historico tecnico espalhado ou inexistente para renovacoes e trocas de servidor.</w:t>
+        <w:t xml:space="preserve">- Dashboard para acompanhar rendimento, custo, pagamentos e pendencias.</w:t>
       </w:r>
     </w:p>
-    <w:p/>
     <w:p>
-      <w:pPr>
-        <w:pStyle w:val="Heading1"/>
-      </w:pPr>
       <w:r>
         <w:t xml:space="preserve">Solucao</w:t>
       </w:r>
     </w:p>
     <w:p>
       <w:r>
-        <w:t xml:space="preserve">O AccessManager centraliza a rotina operacional e financeira em um sistema unico. O modelo do negocio e simples e escalavel: um cliente pode ter varias telas; cada tela esta vinculada a um servidor; o financeiro e gerado por cliente, agrupando os valores das telas ativas.</w:t>
+        <w:t xml:space="preserve">O AccessManager organiza o negocio em um modelo simples: um cliente pode ter varias telas; cada tela pertence a um servidor; o financeiro e calculado por cliente, somando os valores das telas ativas. Esse desenho permite acompanhar cada acesso individualmente e, ao mesmo tempo, cobrar o cliente de forma clara.</w:t>
       </w:r>
     </w:p>
     <w:p>
       <w:r>
-        <w:t xml:space="preserve">Isso permite cobrar o cliente de forma clara, acompanhar cada tela separadamente e manter a operacao tecnica independente do controle financeiro. Um pagamento nao renova automaticamente a tela, e uma renovacao tecnica nao baixa automaticamente uma cobranca.</w:t>
-      </w:r>
-    </w:p>
-    <w:p/>
-    <w:p>
-      <w:pPr>
-        <w:pStyle w:val="Heading1"/>
-      </w:pPr>
-      <w:r>
-        <w:t xml:space="preserve">Como funciona</w:t>
+        <w:t xml:space="preserve">O pagamento continua manual e nao renova automaticamente uma tela. A renovacao tecnica tambem e manual e nao baixa cobrancas. Essa separacao protege a operacao e evita misturar regras financeiras com acesso tecnico.</w:t>
       </w:r>
     </w:p>
     <w:p>
-      <w:pPr>
-        <w:pStyle w:val="Heading2"/>
-      </w:pPr>
-      <w:r>
-        <w:t xml:space="preserve">Modelo de negocio do sistema</w:t>
-      </w:r>
-    </w:p>
-    <w:p>
-      <w:r>
-        <w:t xml:space="preserve">- Cliente: representa a pessoa ou empresa atendida.</w:t>
-      </w:r>
-    </w:p>
-    <w:p>
-      <w:r>
-        <w:t xml:space="preserve">- Telas: cada cliente pode ter uma ou varias telas, todas independentes.</w:t>
-      </w:r>
-    </w:p>
-    <w:p>
-      <w:r>
-        <w:t xml:space="preserve">- Servidor: cada tela usa um servidor, permitindo acompanhar distribuicao e custo operacional.</w:t>
-      </w:r>
-    </w:p>
-    <w:p>
-      <w:r>
-        <w:t xml:space="preserve">- Financeiro por cliente: a cobranca mensal do cliente e formada pela soma dos valores das telas ativas.</w:t>
-      </w:r>
-    </w:p>
-    <w:p>
-      <w:r>
-        <w:t xml:space="preserve">- Dashboard: mostra a saude operacional e financeira do negocio em tempo de gestao.</w:t>
-      </w:r>
-    </w:p>
-    <w:p>
-      <w:pPr>
-        <w:pStyle w:val="Heading2"/>
-      </w:pPr>
       <w:r>
         <w:t xml:space="preserve">Clientes e telas</w:t>
       </w:r>
     </w:p>
     <w:p>
       <w:r>
-        <w:t xml:space="preserve">Cada tela possui usuario, senha, valor acordado, vencimento tecnico, marca da TV, aplicativo utilizado e campos opcionais como MAC/ID e chave secundaria. Essa granularidade permite tratar cada acesso de forma individual mesmo quando pertence ao mesmo cliente.</w:t>
+        <w:t xml:space="preserve">Cada tela possui usuario, senha, valor acordado, vencimento tecnico, marca da TV, aplicativo utilizado e campos opcionais como MAC/ID e chave secundaria. Isso permite controlar cada acesso com detalhe, mesmo quando o cliente possui varias telas.</w:t>
       </w:r>
     </w:p>
     <w:p>
       <w:r>
-        <w:t xml:space="preserve">Na tela de clientes, o sistema apresenta quantidade de telas ativas, valor total agrupado e status financeiro do mes atual. O status financeiro segue a prioridade: Atrasado, Pendente, Pago e Sem lancamento.</w:t>
+        <w:t xml:space="preserve">O status exibido da tela e inteligente: o sistema preserva telas suspensas ou canceladas e calcula automaticamente quando uma tela esta vencida, vencendo ou ativa com base no vencimento tecnico. Assim, a listagem mostra a situacao real para a gestao sem alterar o status manual salvo.</w:t>
       </w:r>
     </w:p>
     <w:p>
-      <w:pPr>
-        <w:pStyle w:val="Heading2"/>
-      </w:pPr>
+      <w:r>
+        <w:t xml:space="preserve">Na renovacao, o sistema sugere automaticamente uma nova data com +30 dias a partir da maior data entre hoje e o vencimento atual. O calendario continua editavel, permitindo ajustar a data quando houver acordo diferente com o cliente.</w:t>
+      </w:r>
+    </w:p>
+    <w:p>
       <w:r>
         <w:t xml:space="preserve">Servidores</w:t>
       </w:r>
     </w:p>
     <w:p>
       <w:r>
-        <w:t xml:space="preserve">O controle de servidores foi atualizado para trabalhar com quantidade de creditos e custo por credito. O conceito antigo de limite de clientes deixou de ser regra funcional.</w:t>
+        <w:t xml:space="preserve">O controle de servidores trabalha com quantidade de creditos e custo por credito. Esse modelo ajuda o gestor a entender o custo operacional associado aos acessos cadastrados em cada servidor.</w:t>
       </w:r>
     </w:p>
     <w:p>
       <w:r>
-        <w:t xml:space="preserve">Com esse modelo, o negocio consegue enxergar o custo operacional por servidor. O dashboard estima o custo mensal considerando as telas ativas associadas ao servidor e o valor de custo do credito.</w:t>
+        <w:t xml:space="preserve">O dashboard estima o custo mensal com base nas telas ativas e no custo de credito, permitindo comparar faturamento e custo de forma simples.</w:t>
       </w:r>
     </w:p>
     <w:p>
-      <w:pPr>
-        <w:pStyle w:val="Heading2"/>
-      </w:pPr>
       <w:r>
         <w:t xml:space="preserve">Financeiro</w:t>
       </w:r>
     </w:p>
     <w:p>
       <w:r>
-        <w:t xml:space="preserve">O financeiro e por cliente, nao por tela. Ao criar um lancamento, o valor e calculado automaticamente pela soma dos valores acordados das telas ativas do cliente. A competencia financeira e calculada pelo sistema com base na data de vencimento financeiro.</w:t>
+        <w:t xml:space="preserve">O financeiro e por cliente. O valor do lancamento e calculado automaticamente pela soma das telas ativas, reduzindo erro manual e mantendo a cobranca alinhada com o cadastro operacional.</w:t>
       </w:r>
     </w:p>
     <w:p>
       <w:r>
-        <w:t xml:space="preserve">O pagamento continua manual e separado da operacao tecnica. Isso permite que um cliente esteja tecnicamente ativo e ainda possua divida, sem renovar automaticamente nenhuma tela ao marcar uma cobranca como paga.</w:t>
+        <w:t xml:space="preserve">A geracao de pendencias usa o dia de pagamento preferido do cliente. O sistema calcula o proximo vencimento real, considera meses curtos usando o ultimo dia valido e gera um lancamento pendente quando faltam ate 5 dias para o vencimento.</w:t>
       </w:r>
     </w:p>
     <w:p>
       <w:r>
-        <w:t xml:space="preserve">A listagem financeira permite filtrar por cliente, status e tambem por mes/ano, usando a data de vencimento financeiro como referencia.</w:t>
+        <w:t xml:space="preserve">Antes de criar uma pendencia, o sistema verifica se ja existe lancamento para o mesmo cliente e vencimento. Isso evita duplicidade e mantem a carteira financeira organizada.</w:t>
       </w:r>
     </w:p>
     <w:p>
       <w:r>
-        <w:t xml:space="preserve">A geracao de pendencias ocorre 5 dias antes do vencimento financeiro acordado, usando o dia de pagamento preferido do cliente. O sistema mantem uma opcao de geracao manual e tambem executa a rotina automaticamente dentro do proprio sistema. A duplicidade e evitada verificando cliente e vencimento antes de criar um novo lancamento.</w:t>
+        <w:t xml:space="preserve">O pagamento permanece manual. Marcar uma cobranca como paga nao renova tela, nao altera vencimento tecnico e nao cria historico tecnico.</w:t>
       </w:r>
     </w:p>
     <w:p>
-      <w:pPr>
-        <w:pStyle w:val="Heading2"/>
-      </w:pPr>
       <w:r>
         <w:t xml:space="preserve">Dashboard</w:t>
       </w:r>
     </w:p>
     <w:p>
       <w:r>
-        <w:t xml:space="preserve">O dashboard oferece uma visao de gestao para acompanhar operacao e financeiro em conjunto. Ele apresenta rendimento mensal, custo mensal, clientes pagos no mes, clientes pendentes, creditos por servidor e distribuicao de clientes/telas por servidor.</w:t>
+        <w:t xml:space="preserve">O dashboard oferece uma visao de gestao com rendimento mensal, custo mensal, clientes pagos no mes, pendencias financeiras, creditos por servidor e distribuicao de clientes/telas por servidor.</w:t>
       </w:r>
     </w:p>
     <w:p>
       <w:r>
-        <w:t xml:space="preserve">Com faturamento mensal e custo mensal visiveis, o gestor consegue avaliar margem operacional de forma conceitual, identificar pendencias e entender onde os servidores estao sendo mais utilizados.</w:t>
+        <w:t xml:space="preserve">Com essas informacoes, o gestor consegue acompanhar a saude operacional e financeira do negocio em uma unica tela, identificando atrasos, proximos vencimentos e pontos de custo.</w:t>
       </w:r>
     </w:p>
-    <w:p/>
     <w:p>
-      <w:pPr>
-        <w:pStyle w:val="Heading1"/>
-      </w:pPr>
       <w:r>
-        <w:t xml:space="preserve">Funcionalidades</w:t>
+        <w:t xml:space="preserve">Funcionalidades principais</w:t>
       </w:r>
     </w:p>
     <w:p>
@@ -280,7 +209,7 @@
     </w:p>
     <w:p>
       <w:r>
-        <w:t xml:space="preserve">- Cadastro e gestao de servidores com quantidade de creditos e custo por credito.</w:t>
+        <w:t xml:space="preserve">- Cadastro e gestao de servidores com creditos e custo por credito.</w:t>
       </w:r>
     </w:p>
     <w:p>
@@ -290,12 +219,12 @@
     </w:p>
     <w:p>
       <w:r>
-        <w:t xml:space="preserve">- Filtros de telas por cliente e servidor.</w:t>
+        <w:t xml:space="preserve">- Status inteligente das telas por vencimento tecnico.</w:t>
       </w:r>
     </w:p>
     <w:p>
       <w:r>
-        <w:t xml:space="preserve">- Renovacao tecnica manual com historico.</w:t>
+        <w:t xml:space="preserve">- Renovacao tecnica com sugestao automatica de +30 dias.</w:t>
       </w:r>
     </w:p>
     <w:p>
@@ -310,6 +239,16 @@
     </w:p>
     <w:p>
       <w:r>
+        <w:t xml:space="preserve">- Geracao automatica de pendencias pelo dia de pagamento do cliente.</w:t>
+      </w:r>
+    </w:p>
+    <w:p>
+      <w:r>
+        <w:t xml:space="preserve">- Controle de pendencias antes do vencimento.</w:t>
+      </w:r>
+    </w:p>
+    <w:p>
+      <w:r>
         <w:t xml:space="preserve">- Marcacao manual de pagamento.</w:t>
       </w:r>
     </w:p>
@@ -320,95 +259,82 @@
     </w:p>
     <w:p>
       <w:r>
-        <w:t xml:space="preserve">- Filtro financeiro por mes e ano de vencimento.</w:t>
-      </w:r>
-    </w:p>
-    <w:p>
-      <w:r>
-        <w:t xml:space="preserve">- Status financeiro do cliente no mes atual.</w:t>
-      </w:r>
-    </w:p>
-    <w:p>
-      <w:r>
-        <w:t xml:space="preserve">- Geracao automatica diaria de pendencias 5 dias antes do vencimento.</w:t>
-      </w:r>
-    </w:p>
-    <w:p>
-      <w:r>
         <w:t xml:space="preserve">- Dashboard operacional e financeiro.</w:t>
       </w:r>
     </w:p>
     <w:p>
-      <w:r>
-        <w:t xml:space="preserve">- Paginas de dashboard, clientes, servidores, telas, financeiro e historico visual.</w:t>
-      </w:r>
-    </w:p>
-    <w:p/>
-    <w:p>
-      <w:pPr>
-        <w:pStyle w:val="Heading1"/>
-      </w:pPr>
       <w:r>
         <w:t xml:space="preserve">Diferenciais</w:t>
       </w:r>
     </w:p>
     <w:p>
       <w:r>
-        <w:t xml:space="preserve">- Controle tecnico separado do financeiro: pagamento nao renova tela e renovacao nao baixa cobranca.</w:t>
+        <w:t xml:space="preserve">- Separacao clara entre tecnico e financeiro.</w:t>
       </w:r>
     </w:p>
     <w:p>
       <w:r>
-        <w:t xml:space="preserve">- Gestao por telas: cada acesso e acompanhado individualmente.</w:t>
+        <w:t xml:space="preserve">- Menos risco de renovar acesso por engano ao marcar pagamento.</w:t>
       </w:r>
     </w:p>
     <w:p>
       <w:r>
-        <w:t xml:space="preserve">- Visao financeira real: cobranca agrupada por cliente, pendencias, atrasos e pagos no mes.</w:t>
+        <w:t xml:space="preserve">- Controle individual por tela, mesmo em clientes com multiplos acessos.</w:t>
       </w:r>
     </w:p>
     <w:p>
       <w:r>
-        <w:t xml:space="preserve">- Modelo baseado em creditos: servidores deixam de ser apenas cadastro e passam a compor a leitura de custo operacional.</w:t>
+        <w:t xml:space="preserve">- Financeiro mais previsivel com pendencias geradas antes do vencimento.</w:t>
       </w:r>
     </w:p>
     <w:p>
       <w:r>
-        <w:t xml:space="preserve">- Automacao interna: pendencias podem ser geradas automaticamente sem servicos externos.</w:t>
+        <w:t xml:space="preserve">- Leitura rapida de telas vencidas, vencendo e ativas.</w:t>
       </w:r>
     </w:p>
     <w:p>
       <w:r>
-        <w:t xml:space="preserve">- Sistema pronto para escala: a separacao entre clientes, telas, servidores e financeiro permite crescer sem perder controle operacional.</w:t>
+        <w:t xml:space="preserve">- Visao de custo por servidor e rendimento mensal.</w:t>
       </w:r>
     </w:p>
-    <w:p/>
     <w:p>
-      <w:pPr>
-        <w:pStyle w:val="Heading1"/>
-      </w:pPr>
+      <w:r>
+        <w:t xml:space="preserve">- Operacao centralizada sem depender de planilhas soltas.</w:t>
+      </w:r>
+    </w:p>
+    <w:p>
+      <w:r>
+        <w:t xml:space="preserve">Valor para gestao</w:t>
+      </w:r>
+    </w:p>
+    <w:p>
+      <w:r>
+        <w:t xml:space="preserve">O AccessManager ajuda a transformar uma rotina manual em um processo controlado. O gestor sabe quem deve pagar, quais telas precisam de atencao, quais servidores concentram mais uso e quanto a operacao esta rendendo.</w:t>
+      </w:r>
+    </w:p>
+    <w:p>
+      <w:r>
+        <w:t xml:space="preserve">Com status inteligente, sugestao de renovacao, pendencias antecipadas e dashboard financeiro, o sistema reduz esquecimentos e melhora a tomada de decisao no dia a dia.</w:t>
+      </w:r>
+    </w:p>
+    <w:p>
       <w:r>
         <w:t xml:space="preserve">Visao futura</w:t>
       </w:r>
     </w:p>
     <w:p>
       <w:r>
-        <w:t xml:space="preserve">O AccessManager ja cobre o fluxo principal da operacao. As proximas evolucoes planejadas devem respeitar o mesmo modelo: manter financeiro separado do tecnico, evitar automatismos que renovem acesso por pagamento e preservar historico das mudancas importantes.</w:t>
+        <w:t xml:space="preserve">O sistema ja cobre o fluxo principal da operacao. As proximas evolucoes podem incluir consulta completa e filtravel do historico tecnico, melhorias de usabilidade, relatorios avancados, autenticacao real e recursos operacionais de backup e deploy.</w:t>
       </w:r>
     </w:p>
     <w:p>
       <w:r>
-        <w:t xml:space="preserve">Evolucoes futuras previstas incluem uma consulta completa e filtravel do historico tecnico, melhorias de usabilidade, relatorios avancados, autenticacao real e recursos operacionais como backup, deploy e configuracoes de ambiente.</w:t>
-      </w:r>
-    </w:p>
-    <w:p>
-      <w:r>
-        <w:t xml:space="preserve">Ficam fora do escopo atual integracoes externas, cobranca automatica, notificacoes automaticas, renovacao automatica por pagamento, aplicativo mobile e multiempresa.</w:t>
+        <w:t xml:space="preserve">Continuam fora do escopo atual integracoes externas, cobranca automatica, notificacoes automaticas, renovacao automatica por pagamento, aplicativo mobile e multiempresa.</w:t>
       </w:r>
     </w:p>
     <w:sectPr>
-      <w:pgSz w:w="11906" w:h="16838"/>
-      <w:pgMar w:top="1440" w:right="1440" w:bottom="1440" w:left="1440" w:header="708" w:footer="708" w:gutter="0"/>
+      <w:pgSz w:w="12240" w:h="15840"/>
+      <w:pgMar w:top="1440" w:right="1440" w:bottom="1440" w:left="1440" w:header="720" w:footer="720" w:gutter="0"/>
     </w:sectPr>
   </w:body>
 </w:document>

</xml_diff>

<commit_message>
docs: atualizar status financeiro exibido
</commit_message>
<xml_diff>
--- a/AccessManager.docx
+++ b/AccessManager.docx
@@ -38,298 +38,362 @@
 <w:document xmlns:w="http://schemas.openxmlformats.org/wordprocessingml/2006/main">
   <w:body>
     <w:p>
+      <w:pPr>
+        <w:pStyle w:val="Title"/>
+      </w:pPr>
       <w:r>
-        <w:t xml:space="preserve">AccessManager</w:t>
+        <w:t>AccessManager</w:t>
+      </w:r>
+    </w:p>
+    <w:p>
+      <w:pPr>
+        <w:pStyle w:val="Subtitle"/>
+      </w:pPr>
+      <w:r>
+        <w:t>Gestao completa de clientes, telas, servidores e financeiro operacional</w:t>
+      </w:r>
+    </w:p>
+    <w:p>
+      <w:pPr>
+        <w:pStyle w:val="Heading1"/>
+      </w:pPr>
+      <w:r>
+        <w:t>Introducao</w:t>
       </w:r>
     </w:p>
     <w:p>
       <w:r>
-        <w:t xml:space="preserve">Gestao completa de clientes, telas, servidores e financeiro operacional</w:t>
+        <w:t>O AccessManager e uma solucao interna para organizar clientes, telas de acesso, servidores, renovacoes tecnicas e financeiro em um unico painel. O sistema foi pensado para negocios que precisam acompanhar varios acessos por cliente, controlar vencimentos e manter uma visao clara de pagamentos, pendencias e custos operacionais.</w:t>
       </w:r>
     </w:p>
     <w:p>
       <w:r>
-        <w:t xml:space="preserve">Introducao</w:t>
+        <w:t>A plataforma centraliza informacoes que normalmente ficam espalhadas em planilhas, mensagens e anotacoes. Com isso, o gestor ganha previsibilidade, reduz retrabalho e evita confundir renovacao tecnica com pagamento financeiro.</w:t>
+      </w:r>
+    </w:p>
+    <w:p>
+      <w:pPr>
+        <w:pStyle w:val="Heading1"/>
+      </w:pPr>
+      <w:r>
+        <w:t>Problema</w:t>
       </w:r>
     </w:p>
     <w:p>
       <w:r>
-        <w:t xml:space="preserve">O AccessManager e uma solucao interna para organizar a rotina de clientes, telas de acesso, servidores e financeiro em um unico painel. O sistema foi pensado para negocios que precisam acompanhar varios acessos por cliente, controlar vencimentos tecnicos e manter uma visao clara de pagamentos, pendencias e custos operacionais.</w:t>
+        <w:t>Operacoes manuais costumam gerar perda de informacao, cobrancas inconsistentes e dificuldade para saber quais telas estao ativas, vencendo ou vencidas. Tambem e comum faltar clareza sobre clientes pendentes, servidores mais utilizados e custo real da operacao.</w:t>
       </w:r>
     </w:p>
     <w:p>
       <w:r>
-        <w:t xml:space="preserve">A plataforma centraliza informacoes que normalmente ficam espalhadas em planilhas, mensagens e anotacoes. Com isso, o gestor ganha previsibilidade, reduz retrabalho e evita confundir renovacao tecnica com pagamento financeiro.</w:t>
+        <w:t>Principais desafios resolvidos:</w:t>
       </w:r>
     </w:p>
     <w:p>
       <w:r>
-        <w:t xml:space="preserve">Problema</w:t>
+        <w:t>- Visao centralizada de clientes, telas e servidores.</w:t>
       </w:r>
     </w:p>
     <w:p>
       <w:r>
-        <w:t xml:space="preserve">Operacoes manuais costumam gerar perda de informacao, cobrancas inconsistentes e dificuldade para saber quais telas estao ativas, vencendo ou vencidas. Tambem e comum faltar clareza sobre clientes pendentes, servidores mais utilizados e custo real da operacao.</w:t>
+        <w:t>- Controle individual de vencimento tecnico por tela.</w:t>
       </w:r>
     </w:p>
     <w:p>
       <w:r>
-        <w:t xml:space="preserve">Principais desafios resolvidos:</w:t>
+        <w:t>- Status inteligente para identificar telas ativas, vencendo, vencidas, suspensas ou canceladas.</w:t>
       </w:r>
     </w:p>
     <w:p>
       <w:r>
-        <w:t xml:space="preserve">- Visao centralizada de clientes, telas e servidores.</w:t>
+        <w:t>- Status financeiro exibido por situacao real de vencimento, sem alterar o status salvo.</w:t>
       </w:r>
     </w:p>
     <w:p>
       <w:r>
-        <w:t xml:space="preserve">- Controle individual de vencimento tecnico por tela.</w:t>
+        <w:t>- Financeiro separado da renovacao tecnica, reduzindo risco de liberar acesso por engano.</w:t>
       </w:r>
     </w:p>
     <w:p>
       <w:r>
-        <w:t xml:space="preserve">- Status inteligente para identificar telas ativas, vencendo, vencidas, suspensas ou canceladas.</w:t>
+        <w:t>- Pendencias financeiras geradas antes do vencimento, conforme o dia de pagamento do cliente.</w:t>
       </w:r>
     </w:p>
     <w:p>
       <w:r>
-        <w:t xml:space="preserve">- Financeiro separado da renovacao tecnica, reduzindo risco de liberar acesso por engano.</w:t>
+        <w:t>- Dashboard para acompanhar rendimento, custo, pagamentos e pendencias.</w:t>
+      </w:r>
+    </w:p>
+    <w:p>
+      <w:pPr>
+        <w:pStyle w:val="Heading1"/>
+      </w:pPr>
+      <w:r>
+        <w:t>Solucao</w:t>
       </w:r>
     </w:p>
     <w:p>
       <w:r>
-        <w:t xml:space="preserve">- Pendencias financeiras geradas antes do vencimento, conforme o dia de pagamento do cliente.</w:t>
+        <w:t>O AccessManager organiza o negocio em um modelo simples: um cliente pode ter varias telas; cada tela pertence a um servidor; o financeiro e calculado por cliente, somando os valores das telas ativas. Esse desenho permite acompanhar cada acesso individualmente e, ao mesmo tempo, cobrar o cliente de forma clara.</w:t>
       </w:r>
     </w:p>
     <w:p>
       <w:r>
-        <w:t xml:space="preserve">- Dashboard para acompanhar rendimento, custo, pagamentos e pendencias.</w:t>
+        <w:t>O pagamento continua manual e nao renova automaticamente uma tela. A renovacao tecnica tambem e manual e nao baixa cobrancas. Essa separacao protege a operacao e evita misturar regras financeiras com acesso tecnico.</w:t>
+      </w:r>
+    </w:p>
+    <w:p>
+      <w:pPr>
+        <w:pStyle w:val="Heading1"/>
+      </w:pPr>
+      <w:r>
+        <w:t>Clientes e telas</w:t>
       </w:r>
     </w:p>
     <w:p>
       <w:r>
-        <w:t xml:space="preserve">Solucao</w:t>
+        <w:t>Cada tela possui usuario, senha, valor acordado, vencimento tecnico, marca da TV, aplicativo utilizado e campos opcionais como MAC/ID e chave secundaria. Isso permite controlar cada acesso com detalhe, mesmo quando o cliente possui varias telas.</w:t>
       </w:r>
     </w:p>
     <w:p>
       <w:r>
-        <w:t xml:space="preserve">O AccessManager organiza o negocio em um modelo simples: um cliente pode ter varias telas; cada tela pertence a um servidor; o financeiro e calculado por cliente, somando os valores das telas ativas. Esse desenho permite acompanhar cada acesso individualmente e, ao mesmo tempo, cobrar o cliente de forma clara.</w:t>
+        <w:t>O status exibido da tela e inteligente: o sistema preserva telas suspensas ou canceladas e calcula automaticamente quando uma tela esta vencida, vencendo ou ativa com base no vencimento tecnico. Assim, a listagem mostra a situacao real para a gestao sem alterar o status manual salvo.</w:t>
       </w:r>
     </w:p>
     <w:p>
       <w:r>
-        <w:t xml:space="preserve">O pagamento continua manual e nao renova automaticamente uma tela. A renovacao tecnica tambem e manual e nao baixa cobrancas. Essa separacao protege a operacao e evita misturar regras financeiras com acesso tecnico.</w:t>
+        <w:t>Na renovacao, o sistema sugere automaticamente uma nova data com +30 dias a partir da maior data entre hoje e o vencimento atual. O calendario continua editavel, permitindo ajustar a data quando houver acordo diferente com o cliente.</w:t>
+      </w:r>
+    </w:p>
+    <w:p>
+      <w:pPr>
+        <w:pStyle w:val="Heading1"/>
+      </w:pPr>
+      <w:r>
+        <w:t>Servidores</w:t>
       </w:r>
     </w:p>
     <w:p>
       <w:r>
-        <w:t xml:space="preserve">Clientes e telas</w:t>
+        <w:t>O controle de servidores trabalha com quantidade de creditos e custo por credito. Esse modelo ajuda o gestor a entender o custo operacional associado aos acessos cadastrados em cada servidor.</w:t>
       </w:r>
     </w:p>
     <w:p>
       <w:r>
-        <w:t xml:space="preserve">Cada tela possui usuario, senha, valor acordado, vencimento tecnico, marca da TV, aplicativo utilizado e campos opcionais como MAC/ID e chave secundaria. Isso permite controlar cada acesso com detalhe, mesmo quando o cliente possui varias telas.</w:t>
+        <w:t>O dashboard estima o custo mensal com base nas telas ativas e no custo de credito, permitindo comparar faturamento e custo de forma simples.</w:t>
+      </w:r>
+    </w:p>
+    <w:p>
+      <w:pPr>
+        <w:pStyle w:val="Heading1"/>
+      </w:pPr>
+      <w:r>
+        <w:t>Financeiro</w:t>
       </w:r>
     </w:p>
     <w:p>
       <w:r>
-        <w:t xml:space="preserve">O status exibido da tela e inteligente: o sistema preserva telas suspensas ou canceladas e calcula automaticamente quando uma tela esta vencida, vencendo ou ativa com base no vencimento tecnico. Assim, a listagem mostra a situacao real para a gestao sem alterar o status manual salvo.</w:t>
+        <w:t>O financeiro e por cliente. O valor do lancamento e calculado automaticamente pela soma das telas ativas, reduzindo erro manual e mantendo a cobranca alinhada com o cadastro operacional.</w:t>
       </w:r>
     </w:p>
     <w:p>
       <w:r>
-        <w:t xml:space="preserve">Na renovacao, o sistema sugere automaticamente uma nova data com +30 dias a partir da maior data entre hoje e o vencimento atual. O calendario continua editavel, permitindo ajustar a data quando houver acordo diferente com o cliente.</w:t>
+        <w:t>O status financeiro tambem possui leitura inteligente. O status salvo continua sendo manual, mas o sistema calcula um status exibido para mostrar a situacao real: um lancamento pendente, sem pagamento e com vencimento anterior a hoje aparece como atrasado. Lancamentos pagos, cancelados ou ja marcados como atrasados preservam essa exibicao.</w:t>
       </w:r>
     </w:p>
     <w:p>
       <w:r>
-        <w:t xml:space="preserve">Servidores</w:t>
+        <w:t>Com isso, a lista de pendentes fica limpa e nao mistura cobrancas vencidas. A lista de atrasados passa a mostrar tanto atrasos marcados manualmente quanto pendencias vencidas por data. O dashboard tambem evita contar o mesmo lancamento como pendente e atrasado ao mesmo tempo.</w:t>
       </w:r>
     </w:p>
     <w:p>
       <w:r>
-        <w:t xml:space="preserve">O controle de servidores trabalha com quantidade de creditos e custo por credito. Esse modelo ajuda o gestor a entender o custo operacional associado aos acessos cadastrados em cada servidor.</w:t>
+        <w:t>A geracao de pendencias usa o dia de pagamento preferido do cliente. O sistema calcula o proximo vencimento real, considera meses curtos usando o ultimo dia valido e gera um lancamento pendente quando faltam ate 5 dias para o vencimento.</w:t>
       </w:r>
     </w:p>
     <w:p>
       <w:r>
-        <w:t xml:space="preserve">O dashboard estima o custo mensal com base nas telas ativas e no custo de credito, permitindo comparar faturamento e custo de forma simples.</w:t>
+        <w:t>Antes de criar uma pendencia, o sistema verifica se ja existe lancamento para o mesmo cliente e vencimento. Isso evita duplicidade e mantem a carteira financeira organizada.</w:t>
       </w:r>
     </w:p>
     <w:p>
       <w:r>
-        <w:t xml:space="preserve">Financeiro</w:t>
+        <w:t>O pagamento permanece manual. Marcar uma cobranca como paga nao renova tela, nao altera vencimento tecnico e nao cria historico tecnico.</w:t>
+      </w:r>
+    </w:p>
+    <w:p>
+      <w:pPr>
+        <w:pStyle w:val="Heading1"/>
+      </w:pPr>
+      <w:r>
+        <w:t>Dashboard</w:t>
       </w:r>
     </w:p>
     <w:p>
       <w:r>
-        <w:t xml:space="preserve">O financeiro e por cliente. O valor do lancamento e calculado automaticamente pela soma das telas ativas, reduzindo erro manual e mantendo a cobranca alinhada com o cadastro operacional.</w:t>
+        <w:t>O dashboard oferece uma visao de gestao com rendimento mensal, custo mensal, clientes pagos no mes, pendencias financeiras, creditos por servidor e distribuicao de clientes/telas por servidor.</w:t>
       </w:r>
     </w:p>
     <w:p>
       <w:r>
-        <w:t xml:space="preserve">A geracao de pendencias usa o dia de pagamento preferido do cliente. O sistema calcula o proximo vencimento real, considera meses curtos usando o ultimo dia valido e gera um lancamento pendente quando faltam ate 5 dias para o vencimento.</w:t>
+        <w:t>Como pendentes e atrasados sao separados pela regra de exibicao financeira, o gestor consegue acompanhar a carteira sem duplicidade e identificar rapidamente cobrancas que precisam de acao.</w:t>
+      </w:r>
+    </w:p>
+    <w:p>
+      <w:pPr>
+        <w:pStyle w:val="Heading1"/>
+      </w:pPr>
+      <w:r>
+        <w:t>Funcionalidades principais</w:t>
       </w:r>
     </w:p>
     <w:p>
       <w:r>
-        <w:t xml:space="preserve">Antes de criar uma pendencia, o sistema verifica se ja existe lancamento para o mesmo cliente e vencimento. Isso evita duplicidade e mantem a carteira financeira organizada.</w:t>
+        <w:t>- Cadastro e gestao de clientes.</w:t>
       </w:r>
     </w:p>
     <w:p>
       <w:r>
-        <w:t xml:space="preserve">O pagamento permanece manual. Marcar uma cobranca como paga nao renova tela, nao altera vencimento tecnico e nao cria historico tecnico.</w:t>
+        <w:t>- Cadastro e gestao de servidores com creditos e custo por credito.</w:t>
       </w:r>
     </w:p>
     <w:p>
       <w:r>
-        <w:t xml:space="preserve">Dashboard</w:t>
+        <w:t>- Cadastro e gestao de telas por cliente.</w:t>
       </w:r>
     </w:p>
     <w:p>
       <w:r>
-        <w:t xml:space="preserve">O dashboard oferece uma visao de gestao com rendimento mensal, custo mensal, clientes pagos no mes, pendencias financeiras, creditos por servidor e distribuicao de clientes/telas por servidor.</w:t>
+        <w:t>- Status inteligente das telas por vencimento tecnico.</w:t>
       </w:r>
     </w:p>
     <w:p>
       <w:r>
-        <w:t xml:space="preserve">Com essas informacoes, o gestor consegue acompanhar a saude operacional e financeira do negocio em uma unica tela, identificando atrasos, proximos vencimentos e pontos de custo.</w:t>
+        <w:t>- Renovacao tecnica com sugestao automatica de +30 dias.</w:t>
       </w:r>
     </w:p>
     <w:p>
       <w:r>
-        <w:t xml:space="preserve">Funcionalidades principais</w:t>
+        <w:t>- Troca manual de servidor com historico.</w:t>
       </w:r>
     </w:p>
     <w:p>
       <w:r>
-        <w:t xml:space="preserve">- Cadastro e gestao de clientes.</w:t>
+        <w:t>- Lancamentos financeiros por cliente com valor agrupado.</w:t>
       </w:r>
     </w:p>
     <w:p>
       <w:r>
-        <w:t xml:space="preserve">- Cadastro e gestao de servidores com creditos e custo por credito.</w:t>
+        <w:t>- Status financeiro exibido por vencimento, separado do status salvo.</w:t>
       </w:r>
     </w:p>
     <w:p>
       <w:r>
-        <w:t xml:space="preserve">- Cadastro e gestao de telas por cliente.</w:t>
+        <w:t>- Geracao automatica de pendencias pelo dia de pagamento do cliente.</w:t>
       </w:r>
     </w:p>
     <w:p>
       <w:r>
-        <w:t xml:space="preserve">- Status inteligente das telas por vencimento tecnico.</w:t>
+        <w:t>- Controle de pendencias antes e depois do vencimento.</w:t>
       </w:r>
     </w:p>
     <w:p>
       <w:r>
-        <w:t xml:space="preserve">- Renovacao tecnica com sugestao automatica de +30 dias.</w:t>
+        <w:t>- Marcacao manual de pagamento.</w:t>
       </w:r>
     </w:p>
     <w:p>
       <w:r>
-        <w:t xml:space="preserve">- Troca manual de servidor com historico.</w:t>
+        <w:t>- Listagens de pendentes e atrasados sem duplicidade.</w:t>
       </w:r>
     </w:p>
     <w:p>
       <w:r>
-        <w:t xml:space="preserve">- Lancamentos financeiros por cliente com valor agrupado.</w:t>
+        <w:t>- Dashboard operacional e financeiro.</w:t>
+      </w:r>
+    </w:p>
+    <w:p>
+      <w:pPr>
+        <w:pStyle w:val="Heading1"/>
+      </w:pPr>
+      <w:r>
+        <w:t>Diferenciais</w:t>
       </w:r>
     </w:p>
     <w:p>
       <w:r>
-        <w:t xml:space="preserve">- Geracao automatica de pendencias pelo dia de pagamento do cliente.</w:t>
+        <w:t>- Separacao clara entre tecnico e financeiro.</w:t>
       </w:r>
     </w:p>
     <w:p>
       <w:r>
-        <w:t xml:space="preserve">- Controle de pendencias antes do vencimento.</w:t>
+        <w:t>- Menos risco de renovar acesso por engano ao marcar pagamento.</w:t>
       </w:r>
     </w:p>
     <w:p>
       <w:r>
-        <w:t xml:space="preserve">- Marcacao manual de pagamento.</w:t>
+        <w:t>- Controle individual por tela, mesmo em clientes com multiplos acessos.</w:t>
       </w:r>
     </w:p>
     <w:p>
       <w:r>
-        <w:t xml:space="preserve">- Listagens de pendentes e atrasados.</w:t>
+        <w:t>- Financeiro mais previsivel com pendencias geradas antes do vencimento.</w:t>
       </w:r>
     </w:p>
     <w:p>
       <w:r>
-        <w:t xml:space="preserve">- Dashboard operacional e financeiro.</w:t>
+        <w:t>- Identificacao automatica de cobrancas vencidas na exibicao financeira.</w:t>
       </w:r>
     </w:p>
     <w:p>
       <w:r>
-        <w:t xml:space="preserve">Diferenciais</w:t>
+        <w:t>- Leitura rapida de telas vencidas, vencendo e ativas.</w:t>
       </w:r>
     </w:p>
     <w:p>
       <w:r>
-        <w:t xml:space="preserve">- Separacao clara entre tecnico e financeiro.</w:t>
+        <w:t>- Visao de custo por servidor e rendimento mensal.</w:t>
       </w:r>
     </w:p>
     <w:p>
       <w:r>
-        <w:t xml:space="preserve">- Menos risco de renovar acesso por engano ao marcar pagamento.</w:t>
+        <w:t>- Operacao centralizada sem depender de planilhas soltas.</w:t>
+      </w:r>
+    </w:p>
+    <w:p>
+      <w:pPr>
+        <w:pStyle w:val="Heading1"/>
+      </w:pPr>
+      <w:r>
+        <w:t>Valor para gestao</w:t>
       </w:r>
     </w:p>
     <w:p>
       <w:r>
-        <w:t xml:space="preserve">- Controle individual por tela, mesmo em clientes com multiplos acessos.</w:t>
+        <w:t>O AccessManager ajuda a transformar uma rotina manual em um processo controlado. O gestor sabe quem deve pagar, quais cobrancas ja venceram, quais telas precisam de atencao, quais servidores concentram mais uso e quanto a operacao esta rendendo.</w:t>
       </w:r>
     </w:p>
     <w:p>
       <w:r>
-        <w:t xml:space="preserve">- Financeiro mais previsivel com pendencias geradas antes do vencimento.</w:t>
+        <w:t>Com status inteligente, sugestao de renovacao, pendencias antecipadas, atraso financeiro calculado e dashboard financeiro, o sistema reduz esquecimentos e melhora a tomada de decisao no dia a dia.</w:t>
+      </w:r>
+    </w:p>
+    <w:p>
+      <w:pPr>
+        <w:pStyle w:val="Heading1"/>
+      </w:pPr>
+      <w:r>
+        <w:t>Visao futura</w:t>
       </w:r>
     </w:p>
     <w:p>
       <w:r>
-        <w:t xml:space="preserve">- Leitura rapida de telas vencidas, vencendo e ativas.</w:t>
+        <w:t>O sistema ja cobre o fluxo principal da operacao. As proximas evolucoes podem incluir consulta completa e filtravel do historico tecnico, melhorias de usabilidade, relatorios avancados, autenticacao real e recursos operacionais de backup e deploy.</w:t>
       </w:r>
     </w:p>
     <w:p>
       <w:r>
-        <w:t xml:space="preserve">- Visao de custo por servidor e rendimento mensal.</w:t>
-      </w:r>
-    </w:p>
-    <w:p>
-      <w:r>
-        <w:t xml:space="preserve">- Operacao centralizada sem depender de planilhas soltas.</w:t>
-      </w:r>
-    </w:p>
-    <w:p>
-      <w:r>
-        <w:t xml:space="preserve">Valor para gestao</w:t>
-      </w:r>
-    </w:p>
-    <w:p>
-      <w:r>
-        <w:t xml:space="preserve">O AccessManager ajuda a transformar uma rotina manual em um processo controlado. O gestor sabe quem deve pagar, quais telas precisam de atencao, quais servidores concentram mais uso e quanto a operacao esta rendendo.</w:t>
-      </w:r>
-    </w:p>
-    <w:p>
-      <w:r>
-        <w:t xml:space="preserve">Com status inteligente, sugestao de renovacao, pendencias antecipadas e dashboard financeiro, o sistema reduz esquecimentos e melhora a tomada de decisao no dia a dia.</w:t>
-      </w:r>
-    </w:p>
-    <w:p>
-      <w:r>
-        <w:t xml:space="preserve">Visao futura</w:t>
-      </w:r>
-    </w:p>
-    <w:p>
-      <w:r>
-        <w:t xml:space="preserve">O sistema ja cobre o fluxo principal da operacao. As proximas evolucoes podem incluir consulta completa e filtravel do historico tecnico, melhorias de usabilidade, relatorios avancados, autenticacao real e recursos operacionais de backup e deploy.</w:t>
-      </w:r>
-    </w:p>
-    <w:p>
-      <w:r>
-        <w:t xml:space="preserve">Continuam fora do escopo atual integracoes externas, cobranca automatica, notificacoes automaticas, renovacao automatica por pagamento, aplicativo mobile e multiempresa.</w:t>
+        <w:t>Continuam fora do escopo atual integracoes externas, cobranca automatica, notificacoes automaticas, renovacao automatica por pagamento, aplicativo mobile e multiempresa.</w:t>
       </w:r>
     </w:p>
     <w:sectPr>

</xml_diff>